<commit_message>
Update prototype design with background rationale and consistent title
Co-Authored-By: Claude Sonnet 5.5 <noreply@anthropic.com>
Claude-Session: https://claude.ai/code/session_01BeuSv6ZfopDpEFLv7nhPKY
</commit_message>
<xml_diff>
--- a/sft_entry/SAGIP_SFT2026_Prototype_Design.docx
+++ b/sft_entry/SAGIP_SFT2026_Prototype_Design.docx
@@ -9,7 +9,7 @@
           <w:color w:val="0B5D8F"/>
           <w:sz w:val="34"/>
         </w:rPr>
-        <w:t>SAGIP: Prototype Design (short)</w:t>
+        <w:t>SAGIP: Solar-Powered Estero Guardian with On-Chip AI (Prototype Design)</w:t>
       </w:r>
     </w:p>
     <w:p>
@@ -98,7 +98,66 @@
           <w:color w:val="0B5D8F"/>
           <w:sz w:val="26"/>
         </w:rPr>
-        <w:t>2. How it works</w:t>
+        <w:t>2. Why it is built this way</w:t>
+      </w:r>
+    </w:p>
+    <w:p>
+      <w:pPr>
+        <w:pStyle w:val="ListBullet"/>
+        <w:spacing w:after="20"/>
+      </w:pPr>
+      <w:r>
+        <w:rPr>
+          <w:b/>
+        </w:rPr>
+        <w:t xml:space="preserve">Hyacinth: </w:t>
+      </w:r>
+      <w:r>
+        <w:t>water hyacinth mats carried most of the floating plastic counted in a Saigon River study (Schreyers et al., 2021), so the boom needs a deflector and the arm must tell plastic from vegetation.</w:t>
+      </w:r>
+    </w:p>
+    <w:p>
+      <w:pPr>
+        <w:pStyle w:val="ListBullet"/>
+        <w:spacing w:after="20"/>
+      </w:pPr>
+      <w:r>
+        <w:rPr>
+          <w:b/>
+        </w:rPr>
+        <w:t xml:space="preserve">Rain pulses: </w:t>
+      </w:r>
+      <w:r>
+        <w:t>debris release in Greater Jakarta rose in the rainy season (Cordova &amp; Nurhati, 2019), so the device logs every item with time and water level and we compare counts with rainfall.</w:t>
+      </w:r>
+    </w:p>
+    <w:p>
+      <w:pPr>
+        <w:pStyle w:val="ListBullet"/>
+        <w:spacing w:after="20"/>
+      </w:pPr>
+      <w:r>
+        <w:rPr>
+          <w:b/>
+        </w:rPr>
+        <w:t xml:space="preserve">On-chip AI: </w:t>
+      </w:r>
+      <w:r>
+        <w:t>INT8 quantization shrinks a model about fourfold (Jacob et al., 2018) and TensorFlow Lite for Microcontrollers runs it on an ESP32-S3 (David et al., 2021), so no internet is needed.</w:t>
+      </w:r>
+    </w:p>
+    <w:p>
+      <w:pPr>
+        <w:keepNext/>
+        <w:spacing w:before="160" w:after="60"/>
+      </w:pPr>
+      <w:r>
+        <w:rPr>
+          <w:b/>
+          <w:color w:val="0B5D8F"/>
+          <w:sz w:val="26"/>
+        </w:rPr>
+        <w:t>3. How it works</w:t>
       </w:r>
     </w:p>
     <w:p>
@@ -202,7 +261,7 @@
           <w:color w:val="0B5D8F"/>
           <w:sz w:val="26"/>
         </w:rPr>
-        <w:t>3. The electronics box</w:t>
+        <w:t>4. The electronics box</w:t>
       </w:r>
     </w:p>
     <w:p>
@@ -312,7 +371,7 @@
           <w:color w:val="0B5D8F"/>
           <w:sz w:val="26"/>
         </w:rPr>
-        <w:t>4. Materials and cost (estimated local prices, to be confirmed)</w:t>
+        <w:t>5. Materials and cost (estimated local prices, to be confirmed)</w:t>
       </w:r>
     </w:p>
     <w:tbl>
@@ -1425,7 +1484,7 @@
           <w:color w:val="0B5D8F"/>
           <w:sz w:val="26"/>
         </w:rPr>
-        <w:t>5. What we expect (to be tested, not promised)</w:t>
+        <w:t>6. What we expect (to be tested, not promised)</w:t>
       </w:r>
     </w:p>
     <w:p>
@@ -1470,12 +1529,20 @@
           <w:color w:val="0B5D8F"/>
           <w:sz w:val="26"/>
         </w:rPr>
-        <w:t>6. Build steps</w:t>
+        <w:t>7. Build steps</w:t>
       </w:r>
     </w:p>
     <w:p>
       <w:r>
         <w:t>Oct 28 to Nov 2: site visit, barangay letter, photographs and labels, bench power test. Nov 3 to 20: Stage 1 bench build with the model on the ESP32-S3, and a baseline week at the creek. Stage 2 passive trap, then Stage 3 arm and sensor after a wet bench test with hyacinth, silt and a little cooking oil. Pilot December to February: weekly emptying, hand count and report to the barangay.</w:t>
+      </w:r>
+    </w:p>
+    <w:p>
+      <w:r>
+        <w:rPr>
+          <w:sz w:val="18"/>
+        </w:rPr>
+        <w:t>Sources: Cordova &amp; Nurhati (2019), Scientific Reports 9, 18730. David et al. (2021), Proceedings of Machine Learning and Systems 3. Jacob et al. (2018), CVPR. Schreyers et al. (2021), Frontiers in Environmental Science 9, 686334. Full list in the written entry.</w:t>
       </w:r>
     </w:p>
     <w:sectPr>

</xml_diff>

<commit_message>
Add 3D model (STL and numbered preview), update prototype design doc and sync entry description with the Google Doc
Co-Authored-By: Claude Sonnet 5.5 <noreply@anthropic.com>
Claude-Session: https://claude.ai/code/session_01BeuSv9ktphNSqgYLtwXpw3
</commit_message>
<xml_diff>
--- a/sft_entry/SAGIP_SFT2026_Prototype_Design.docx
+++ b/sft_entry/SAGIP_SFT2026_Prototype_Design.docx
@@ -14,7 +14,7 @@
     </w:p>
     <w:p>
       <w:r>
-        <w:t>Quick visual of what we will build and buy. Quezon City Science High School, Grade 10 team. Adviser: Skjoukje U. Jemoya. All costs and sizes are planning estimates.</w:t>
+        <w:t>Quick visual of what we will build and buy. Quezon City Science High School, Grade 10 team. Adviser: Skjoukje U. Jemoya. Site: Dario River. All costs and sizes are planning estimates.</w:t>
       </w:r>
     </w:p>
     <w:p>
@@ -33,7 +33,7 @@
     </w:p>
     <w:p>
       <w:r>
-        <w:t>A solar-powered robot boat, about 1.5 m long, patrols a creek between two floating barriers. A bow camera spots floating debris, the boat steers to it, and a scoop lifts it onto a conveyor. A second camera under a hood names each item with a small 2D convolutional neural network (CNN), and a servo gate sorts plastic and plants into two bins. A weekly offline report goes to the barangay. A separate float-switch node on the bank sounds a flood alarm.</w:t>
+        <w:t>A solar-powered robot boat, about 1.5 m long, patrols a creek between two floating barriers. A bow camera runs an object detector that boxes floating plastic, the boat steers to it, and a scoop lifts it onto a cleated conveyor, one item per pocket. A second camera under a light-tight hood names each item with a small 2D convolutional neural network (CNN), and a servo gate sorts plastic into Bin A and plants, mixed or unsure items into Bin B. A weekly offline report goes to the barangay and a monthly Plastic Trend Scoreboard goes up at the Barangay Hall. A separate float-switch node on the bank sounds a flood alarm.</w:t>
       </w:r>
     </w:p>
     <w:p>
@@ -140,6 +140,57 @@
     </w:p>
     <w:p>
       <w:pPr>
+        <w:jc w:val="center"/>
+      </w:pPr>
+      <w:r>
+        <w:drawing>
+          <wp:inline xmlns:a="http://schemas.openxmlformats.org/drawingml/2006/main" xmlns:pic="http://schemas.openxmlformats.org/drawingml/2006/picture">
+            <wp:extent cx="6035040" cy="3507029"/>
+            <wp:docPr id="3" name="Picture 3"/>
+            <wp:cNvGraphicFramePr>
+              <a:graphicFrameLocks noChangeAspect="1"/>
+            </wp:cNvGraphicFramePr>
+            <a:graphic>
+              <a:graphicData uri="http://schemas.openxmlformats.org/drawingml/2006/picture">
+                <pic:pic>
+                  <pic:nvPicPr>
+                    <pic:cNvPr id="0" name="fig_3d_iso.png"/>
+                    <pic:cNvPicPr/>
+                  </pic:nvPicPr>
+                  <pic:blipFill>
+                    <a:blip r:embed="rId13"/>
+                    <a:stretch>
+                      <a:fillRect/>
+                    </a:stretch>
+                  </pic:blipFill>
+                  <pic:spPr>
+                    <a:xfrm>
+                      <a:off x="0" y="0"/>
+                      <a:ext cx="6035040" cy="3507029"/>
+                    </a:xfrm>
+                    <a:prstGeom prst="rect"/>
+                  </pic:spPr>
+                </pic:pic>
+              </a:graphicData>
+            </a:graphic>
+          </wp:inline>
+        </w:drawing>
+      </w:r>
+    </w:p>
+    <w:p>
+      <w:pPr>
+        <w:jc w:val="center"/>
+      </w:pPr>
+      <w:r>
+        <w:rPr>
+          <w:i/>
+          <w:sz w:val="17"/>
+        </w:rPr>
+        <w:t>3D model, isometric view with the deck see-through. Numbers match the parts table. Side and top views are in SAGIP_Boat_3D_Model.png, and the STL imports into Tinkercad.</w:t>
+      </w:r>
+    </w:p>
+    <w:p>
+      <w:pPr>
         <w:keepNext/>
         <w:spacing w:before="160" w:after="60"/>
       </w:pPr>
@@ -161,8 +212,8 @@
       </w:tblPr>
       <w:tblGrid>
         <w:gridCol w:w="720"/>
-        <w:gridCol w:w="3312"/>
-        <w:gridCol w:w="5184"/>
+        <w:gridCol w:w="3600"/>
+        <w:gridCol w:w="4896"/>
       </w:tblGrid>
       <w:tr>
         <w:tc>
@@ -185,7 +236,7 @@
         </w:tc>
         <w:tc>
           <w:tcPr>
-            <w:tcW w:type="dxa" w:w="3312"/>
+            <w:tcW w:type="dxa" w:w="3600"/>
             <w:shd w:val="clear" w:color="auto" w:fill="DCEBF5"/>
           </w:tcPr>
           <w:p>
@@ -203,7 +254,7 @@
         </w:tc>
         <w:tc>
           <w:tcPr>
-            <w:tcW w:type="dxa" w:w="5184"/>
+            <w:tcW w:type="dxa" w:w="4896"/>
             <w:shd w:val="clear" w:color="auto" w:fill="DCEBF5"/>
           </w:tcPr>
           <w:p>
@@ -239,7 +290,7 @@
         </w:tc>
         <w:tc>
           <w:tcPr>
-            <w:tcW w:type="dxa" w:w="3312"/>
+            <w:tcW w:type="dxa" w:w="3600"/>
           </w:tcPr>
           <w:p>
             <w:pPr>
@@ -249,13 +300,13 @@
               <w:rPr>
                 <w:sz w:val="19"/>
               </w:rPr>
-              <w:t>Bow camera (ESP32-CAM)</w:t>
+              <w:t>Bow camera (ESP32-CAM Type C)</w:t>
             </w:r>
           </w:p>
         </w:tc>
         <w:tc>
           <w:tcPr>
-            <w:tcW w:type="dxa" w:w="5184"/>
+            <w:tcW w:type="dxa" w:w="4896"/>
           </w:tcPr>
           <w:p>
             <w:pPr>
@@ -265,7 +316,7 @@
               <w:rPr>
                 <w:sz w:val="19"/>
               </w:rPr>
-              <w:t>Spots floating debris ahead so the boat can steer to it</w:t>
+              <w:t>Runs the object detector and boxes floating plastic ahead so the boat can steer to it</w:t>
             </w:r>
           </w:p>
         </w:tc>
@@ -289,7 +340,7 @@
         </w:tc>
         <w:tc>
           <w:tcPr>
-            <w:tcW w:type="dxa" w:w="3312"/>
+            <w:tcW w:type="dxa" w:w="3600"/>
           </w:tcPr>
           <w:p>
             <w:pPr>
@@ -305,7 +356,7 @@
         </w:tc>
         <w:tc>
           <w:tcPr>
-            <w:tcW w:type="dxa" w:w="5184"/>
+            <w:tcW w:type="dxa" w:w="4896"/>
           </w:tcPr>
           <w:p>
             <w:pPr>
@@ -339,7 +390,7 @@
         </w:tc>
         <w:tc>
           <w:tcPr>
-            <w:tcW w:type="dxa" w:w="3312"/>
+            <w:tcW w:type="dxa" w:w="3600"/>
           </w:tcPr>
           <w:p>
             <w:pPr>
@@ -355,7 +406,7 @@
         </w:tc>
         <w:tc>
           <w:tcPr>
-            <w:tcW w:type="dxa" w:w="5184"/>
+            <w:tcW w:type="dxa" w:w="4896"/>
           </w:tcPr>
           <w:p>
             <w:pPr>
@@ -365,7 +416,7 @@
               <w:rPr>
                 <w:sz w:val="19"/>
               </w:rPr>
-              <w:t>Carries items up in a single layer</w:t>
+              <w:t>Carries items up, one item per cleat pocket</w:t>
             </w:r>
           </w:p>
         </w:tc>
@@ -389,7 +440,7 @@
         </w:tc>
         <w:tc>
           <w:tcPr>
-            <w:tcW w:type="dxa" w:w="3312"/>
+            <w:tcW w:type="dxa" w:w="3600"/>
           </w:tcPr>
           <w:p>
             <w:pPr>
@@ -399,13 +450,13 @@
               <w:rPr>
                 <w:sz w:val="19"/>
               </w:rPr>
-              <w:t>Belt camera and CNN (ESP32-S3)</w:t>
+              <w:t>Belt camera and CNN (ESP32-S3) under a hood</w:t>
             </w:r>
           </w:p>
         </w:tc>
         <w:tc>
           <w:tcPr>
-            <w:tcW w:type="dxa" w:w="5184"/>
+            <w:tcW w:type="dxa" w:w="4896"/>
           </w:tcPr>
           <w:p>
             <w:pPr>
@@ -415,7 +466,7 @@
               <w:rPr>
                 <w:sz w:val="19"/>
               </w:rPr>
-              <w:t>Names each item under a lit hood</w:t>
+              <w:t>Names each item in the same light, and a blob count flags mixed items</w:t>
             </w:r>
           </w:p>
         </w:tc>
@@ -439,7 +490,7 @@
         </w:tc>
         <w:tc>
           <w:tcPr>
-            <w:tcW w:type="dxa" w:w="3312"/>
+            <w:tcW w:type="dxa" w:w="3600"/>
           </w:tcPr>
           <w:p>
             <w:pPr>
@@ -455,7 +506,7 @@
         </w:tc>
         <w:tc>
           <w:tcPr>
-            <w:tcW w:type="dxa" w:w="5184"/>
+            <w:tcW w:type="dxa" w:w="4896"/>
           </w:tcPr>
           <w:p>
             <w:pPr>
@@ -465,7 +516,7 @@
               <w:rPr>
                 <w:sz w:val="19"/>
               </w:rPr>
-              <w:t>Plastic to Bin A, plants or unsure items to Bin B</w:t>
+              <w:t>Plastic to Bin A, plants, mixed or unsure items to Bin B</w:t>
             </w:r>
           </w:p>
         </w:tc>
@@ -489,7 +540,7 @@
         </w:tc>
         <w:tc>
           <w:tcPr>
-            <w:tcW w:type="dxa" w:w="3312"/>
+            <w:tcW w:type="dxa" w:w="3600"/>
           </w:tcPr>
           <w:p>
             <w:pPr>
@@ -505,7 +556,7 @@
         </w:tc>
         <w:tc>
           <w:tcPr>
-            <w:tcW w:type="dxa" w:w="5184"/>
+            <w:tcW w:type="dxa" w:w="4896"/>
           </w:tcPr>
           <w:p>
             <w:pPr>
@@ -515,7 +566,7 @@
               <w:rPr>
                 <w:sz w:val="19"/>
               </w:rPr>
-              <w:t>Two ESP32 boards, drivers, converters</w:t>
+              <w:t>ESP32 boards, drivers, converters, tilt sensor</w:t>
             </w:r>
           </w:p>
         </w:tc>
@@ -539,7 +590,7 @@
         </w:tc>
         <w:tc>
           <w:tcPr>
-            <w:tcW w:type="dxa" w:w="3312"/>
+            <w:tcW w:type="dxa" w:w="3600"/>
           </w:tcPr>
           <w:p>
             <w:pPr>
@@ -555,7 +606,7 @@
         </w:tc>
         <w:tc>
           <w:tcPr>
-            <w:tcW w:type="dxa" w:w="5184"/>
+            <w:tcW w:type="dxa" w:w="4896"/>
           </w:tcPr>
           <w:p>
             <w:pPr>
@@ -565,7 +616,7 @@
               <w:rPr>
                 <w:sz w:val="19"/>
               </w:rPr>
-              <w:t>Flat roof over the deck, charges the battery</w:t>
+              <w:t>Flat on the deck, charges the battery</w:t>
             </w:r>
           </w:p>
         </w:tc>
@@ -589,7 +640,7 @@
         </w:tc>
         <w:tc>
           <w:tcPr>
-            <w:tcW w:type="dxa" w:w="3312"/>
+            <w:tcW w:type="dxa" w:w="3600"/>
           </w:tcPr>
           <w:p>
             <w:pPr>
@@ -599,13 +650,13 @@
               <w:rPr>
                 <w:sz w:val="19"/>
               </w:rPr>
-              <w:t>12 V 12 Ah battery</w:t>
+              <w:t>12 V 12 Ah sealed lead-acid battery</w:t>
             </w:r>
           </w:p>
         </w:tc>
         <w:tc>
           <w:tcPr>
-            <w:tcW w:type="dxa" w:w="5184"/>
+            <w:tcW w:type="dxa" w:w="4896"/>
           </w:tcPr>
           <w:p>
             <w:pPr>
@@ -639,7 +690,7 @@
         </w:tc>
         <w:tc>
           <w:tcPr>
-            <w:tcW w:type="dxa" w:w="3312"/>
+            <w:tcW w:type="dxa" w:w="3600"/>
           </w:tcPr>
           <w:p>
             <w:pPr>
@@ -655,7 +706,7 @@
         </w:tc>
         <w:tc>
           <w:tcPr>
-            <w:tcW w:type="dxa" w:w="5184"/>
+            <w:tcW w:type="dxa" w:w="4896"/>
           </w:tcPr>
           <w:p>
             <w:pPr>
@@ -689,7 +740,7 @@
         </w:tc>
         <w:tc>
           <w:tcPr>
-            <w:tcW w:type="dxa" w:w="3312"/>
+            <w:tcW w:type="dxa" w:w="3600"/>
           </w:tcPr>
           <w:p>
             <w:pPr>
@@ -699,13 +750,13 @@
               <w:rPr>
                 <w:sz w:val="19"/>
               </w:rPr>
-              <w:t>Side sensors and compass</w:t>
+              <w:t>Two side ultrasonic sensors, bump switches, compass if needed</w:t>
             </w:r>
           </w:p>
         </w:tc>
         <w:tc>
           <w:tcPr>
-            <w:tcW w:type="dxa" w:w="5184"/>
+            <w:tcW w:type="dxa" w:w="4896"/>
           </w:tcPr>
           <w:p>
             <w:pPr>
@@ -715,7 +766,7 @@
               <w:rPr>
                 <w:sz w:val="19"/>
               </w:rPr>
-              <w:t>Follow the bank, turn at the barriers, tilt cut-off</w:t>
+              <w:t>Follow the bank, sense contact at the bow, hold a heading</w:t>
             </w:r>
           </w:p>
         </w:tc>
@@ -739,7 +790,7 @@
         </w:tc>
         <w:tc>
           <w:tcPr>
-            <w:tcW w:type="dxa" w:w="3312"/>
+            <w:tcW w:type="dxa" w:w="3600"/>
           </w:tcPr>
           <w:p>
             <w:pPr>
@@ -755,7 +806,7 @@
         </w:tc>
         <w:tc>
           <w:tcPr>
-            <w:tcW w:type="dxa" w:w="5184"/>
+            <w:tcW w:type="dxa" w:w="4896"/>
           </w:tcPr>
           <w:p>
             <w:pPr>
@@ -789,7 +840,7 @@
         </w:tc>
         <w:tc>
           <w:tcPr>
-            <w:tcW w:type="dxa" w:w="3312"/>
+            <w:tcW w:type="dxa" w:w="3600"/>
           </w:tcPr>
           <w:p>
             <w:pPr>
@@ -805,7 +856,7 @@
         </w:tc>
         <w:tc>
           <w:tcPr>
-            <w:tcW w:type="dxa" w:w="5184"/>
+            <w:tcW w:type="dxa" w:w="4896"/>
           </w:tcPr>
           <w:p>
             <w:pPr>
@@ -815,7 +866,7 @@
               <w:rPr>
                 <w:sz w:val="19"/>
               </w:rPr>
-              <w:t>Three float switches and a buzzer, boat stays docked from the alert level</w:t>
+              <w:t>Three float switches, buzzer and LED, protected 18650 cell in an IP67 box</w:t>
             </w:r>
           </w:p>
         </w:tc>
@@ -852,7 +903,7 @@
         <w:t xml:space="preserve">Hyacinth: </w:t>
       </w:r>
       <w:r>
-        <w:t>water hyacinth mats carried most of the floating plastic counted in a Saigon River study (Schreyers et al., 2021), so the detector separates plants and the propellers are shrouded.</w:t>
+        <w:t>water hyacinth mats carried most of the floating plastic counted in a Saigon River study (Schreyers et al., 2021), so the upstream barrier angles mats to the bank, the detector separates plants and the propellers are shrouded.</w:t>
       </w:r>
     </w:p>
     <w:p>
@@ -897,7 +948,7 @@
         <w:t xml:space="preserve">Set patrol, no GPS: </w:t>
       </w:r>
       <w:r>
-        <w:t>the creek banks and two barriers define the route, so the boat needs only side sensors, a compass and bump switches.</w:t>
+        <w:t>the creek banks and two barriers define the route, so the boat needs only side sensors, bump switches and a compass if a heading is needed.</w:t>
       </w:r>
     </w:p>
     <w:p>
@@ -912,7 +963,37 @@
         <w:t xml:space="preserve">Stability: </w:t>
       </w:r>
       <w:r>
-        <w:t>twin floats with a wide beam, the battery low between them, foam fill, and a tilt cut-off. Float and tilt tests come first.</w:t>
+        <w:t>twin floats with a wide beam, the battery low between them, foam in the bow and stern, and a tilt cut-off. Float and tilt tests come first.</w:t>
+      </w:r>
+    </w:p>
+    <w:p>
+      <w:pPr>
+        <w:pStyle w:val="ListBullet"/>
+        <w:spacing w:after="20"/>
+      </w:pPr>
+      <w:r>
+        <w:rPr>
+          <w:b/>
+        </w:rPr>
+        <w:t xml:space="preserve">Weather and light: </w:t>
+      </w:r>
+      <w:r>
+        <w:t>a skirted black hood and a fixed LED light every photo the same way, and a hydrophobic film, an angled window and a desiccant pack keep camera housings clear of droplets and fog.</w:t>
+      </w:r>
+    </w:p>
+    <w:p>
+      <w:pPr>
+        <w:pStyle w:val="ListBullet"/>
+        <w:spacing w:after="20"/>
+      </w:pPr>
+      <w:r>
+        <w:rPr>
+          <w:b/>
+        </w:rPr>
+        <w:t xml:space="preserve">One item at a time: </w:t>
+      </w:r>
+      <w:r>
+        <w:t>cleat pockets hold one item each, and a blob count against an empty-belt photograph flags two items in one frame as mixed so they go to Bin B for a hand count.</w:t>
       </w:r>
     </w:p>
     <w:p>
@@ -941,7 +1022,22 @@
         <w:t xml:space="preserve">Patrol: </w:t>
       </w:r>
       <w:r>
-        <w:t>follows the bank, turns at the upstream barrier, returns to the dock when the bins are full or the battery is low. Staff can take over with a phone remote.</w:t>
+        <w:t>follows the bank between two barriers and returns to the dock when the bins are full or the battery is low. Staff can take over with a phone remote.</w:t>
+      </w:r>
+    </w:p>
+    <w:p>
+      <w:pPr>
+        <w:pStyle w:val="ListBullet"/>
+        <w:spacing w:after="20"/>
+      </w:pPr>
+      <w:r>
+        <w:rPr>
+          <w:b/>
+        </w:rPr>
+        <w:t xml:space="preserve">Barriers: </w:t>
+      </w:r>
+      <w:r>
+        <w:t>the upstream barrier is a rope of floats at about 30 degrees to the flow that slides mats and large debris to the bank. The downstream barrier is a straight line of floats that stops drifting debris.</w:t>
       </w:r>
     </w:p>
     <w:p>
@@ -956,7 +1052,7 @@
         <w:t xml:space="preserve">Detect and scoop: </w:t>
       </w:r>
       <w:r>
-        <w:t>a tiny detector boxes debris and separates plastic from plants. The boat steers toward plastic and the scoop lifts it onto the belt.</w:t>
+        <w:t>a small INT8 object detector boxes each floating item and separates plastic from plants. The boat steers to the nearest plastic box and the scoop lifts it onto the belt.</w:t>
       </w:r>
     </w:p>
     <w:p>
@@ -971,7 +1067,7 @@
         <w:t xml:space="preserve">Count and sort: </w:t>
       </w:r>
       <w:r>
-        <w:t>the CNN names each item. Plastic goes to Bin A, plants and low-confidence items go to Bin B. Weekly hand counts check accuracy.</w:t>
+        <w:t>the CNN names each item. Plastic goes to Bin A, and plants, mixed and low-confidence items go to Bin B. Training photographs are augmented with color shifts, blur, rotation, crops, random erasing and synthetic mud and droplets.</w:t>
       </w:r>
     </w:p>
     <w:p>
@@ -986,7 +1082,7 @@
         <w:t xml:space="preserve">Protect: </w:t>
       </w:r>
       <w:r>
-        <w:t>belt and thruster current is monitored. A jam triggers a short reverse, up to three retries, then a stop. Drivers default to off.</w:t>
+        <w:t>belt and thruster current is monitored. A jam triggers a reverse, up to three retries, then a stop and a return to the dock. Drivers default to off.</w:t>
       </w:r>
     </w:p>
     <w:p>
@@ -1001,7 +1097,7 @@
         <w:t xml:space="preserve">Plastic accounting: </w:t>
       </w:r>
       <w:r>
-        <w:t>counts become estimated kilograms and recovery value, corrected by a weekly weigh-in, in an evidence sheet for the barangay and the DENR.</w:t>
+        <w:t>counts become estimated kilograms and value, corrected by a weekly weigh-in, in an evidence sheet for the barangay and the DENR.</w:t>
       </w:r>
     </w:p>
     <w:p>
@@ -1016,7 +1112,7 @@
         <w:t xml:space="preserve">Flood warning: </w:t>
       </w:r>
       <w:r>
-        <w:t>three float switches on a staff gauge set watch, alert and danger levels. A buzzer and beacon sound, and the level is logged.</w:t>
+        <w:t>three float switches on a staff gauge set watch, alert and danger levels. A buzzer and a small LED alert residents nearby and the level is logged.</w:t>
       </w:r>
     </w:p>
     <w:p>
@@ -1030,7 +1126,7 @@
           <w:color w:val="0B5D8F"/>
           <w:sz w:val="26"/>
         </w:rPr>
-        <w:t>5. Power and wiring</w:t>
+        <w:t>5. Power, sleep and safety</w:t>
       </w:r>
     </w:p>
     <w:p>
@@ -1041,7 +1137,7 @@
         <w:drawing>
           <wp:inline xmlns:a="http://schemas.openxmlformats.org/drawingml/2006/main" xmlns:pic="http://schemas.openxmlformats.org/drawingml/2006/picture">
             <wp:extent cx="6035040" cy="3168657"/>
-            <wp:docPr id="3" name="Picture 3"/>
+            <wp:docPr id="4" name="Picture 4"/>
             <wp:cNvGraphicFramePr>
               <a:graphicFrameLocks noChangeAspect="1"/>
             </wp:cNvGraphicFramePr>
@@ -1053,7 +1149,7 @@
                     <pic:cNvPicPr/>
                   </pic:nvPicPr>
                   <pic:blipFill>
-                    <a:blip r:embed="rId13"/>
+                    <a:blip r:embed="rId14"/>
                     <a:stretch>
                       <a:fillRect/>
                     </a:stretch>
@@ -1112,6 +1208,36 @@
       </w:r>
       <w:r>
         <w:t>each motor has its own fuse and driver, the master switch cuts everything, and a low-battery rule skips patrols.</w:t>
+      </w:r>
+    </w:p>
+    <w:p>
+      <w:pPr>
+        <w:pStyle w:val="ListBullet"/>
+        <w:spacing w:after="20"/>
+      </w:pPr>
+      <w:r>
+        <w:rPr>
+          <w:b/>
+        </w:rPr>
+        <w:t xml:space="preserve">Deep sleep: </w:t>
+      </w:r>
+      <w:r>
+        <w:t>docked boards sleep and wake on a timer for each patrol, then check the flood node's last status. On patrol the bow camera idles until it sees plastic and the belt camera and LED power up only when an item arrives. The flood node sleeps until a float switch trips and wakes every ten minutes to report.</w:t>
+      </w:r>
+    </w:p>
+    <w:p>
+      <w:pPr>
+        <w:pStyle w:val="ListBullet"/>
+        <w:spacing w:after="20"/>
+      </w:pPr>
+      <w:r>
+        <w:rPr>
+          <w:b/>
+        </w:rPr>
+        <w:t xml:space="preserve">End of life and battery safety: </w:t>
+      </w:r>
+      <w:r>
+        <w:t>PVC floats, plastic bins and stainless hardware are materials local junk shops take, foam is kept to the minimum, and the lead-acid battery goes back to a dealer. The flood node's protected 18650 cell sits in an IP67 box with overcharge and over-discharge protection.</w:t>
       </w:r>
     </w:p>
     <w:p>
@@ -1190,7 +1316,7 @@
               <w:rPr>
                 <w:sz w:val="19"/>
               </w:rPr>
-              <w:t>Two 6-inch PVC floats with foam fill, frame and deck</w:t>
+              <w:t>Two 6-inch PVC floats, foam, frame and deck</w:t>
             </w:r>
           </w:p>
         </w:tc>
@@ -1260,7 +1386,7 @@
               <w:rPr>
                 <w:sz w:val="19"/>
               </w:rPr>
-              <w:t>Short cleated conveyor, gear motor and driver</w:t>
+              <w:t>Cleated conveyor, gear motor and driver</w:t>
             </w:r>
           </w:p>
         </w:tc>
@@ -1365,7 +1491,7 @@
               <w:rPr>
                 <w:sz w:val="19"/>
               </w:rPr>
-              <w:t>Compass with tilt sensor, three waterproof ultrasonic sensors, bump switches</w:t>
+              <w:t>Compass, tilt and ultrasonic sensors, bump switches</w:t>
             </w:r>
           </w:p>
         </w:tc>
@@ -1470,7 +1596,7 @@
               <w:rPr>
                 <w:sz w:val="19"/>
               </w:rPr>
-              <w:t>30 W solar panel and 20 A controller (Shopee listing at about 1,084)</w:t>
+              <w:t>30 W solar panel and 20 A charge controller</w:t>
             </w:r>
           </w:p>
         </w:tc>
@@ -1540,7 +1666,7 @@
               <w:rPr>
                 <w:sz w:val="19"/>
               </w:rPr>
-              <w:t>Flood node with three float switches, buzzer, mini panel, cell, staff gauge</w:t>
+              <w:t>Flood node: ESP32, float switches, buzzer, mini panel, cell, gauge</w:t>
             </w:r>
           </w:p>
         </w:tc>
@@ -1575,7 +1701,7 @@
               <w:rPr>
                 <w:sz w:val="19"/>
               </w:rPr>
-              <w:t>Bank dock and two barriers (rope, floats, post from the barangay)</w:t>
+              <w:t>Bank dock and two barriers (rope, floats, post)</w:t>
             </w:r>
           </w:p>
         </w:tc>
@@ -1685,7 +1811,7 @@
                 <w:b/>
                 <w:sz w:val="19"/>
               </w:rPr>
-              <w:t>Pilot total</w:t>
+              <w:t>Total</w:t>
             </w:r>
           </w:p>
         </w:tc>
@@ -1716,7 +1842,7 @@
     </w:p>
     <w:p>
       <w:r>
-        <w:t>Materials: PVC floats and deck, PVC or plastic stock for the scoop and belt frame, stainless fasteners, an IP65 box for the electronics. These are pilot-grade and should last months. At scale we would standardize to HDPE pipe floats and sturdier belts. Tools to borrow: soldering iron, multimeter, drill, saw, pliers, kitchen scale.</w:t>
+        <w:t>Materials: PVC floats and deck, PVC or plastic stock for the scoop and belt frame, stainless fasteners (316 if the estero is brackish), IP65 boxes for the electronics, battery and bow camera and an IP67 box for the flood node cell. These are pilot-grade and should last months. At scale we would standardize to HDPE pipe floats and sturdier belts. Tools to borrow: soldering iron, multimeter, drill, saw, pliers, kitchen scale.</w:t>
       </w:r>
     </w:p>
     <w:p>
@@ -1762,7 +1888,7 @@
     </w:p>
     <w:p>
       <w:r>
-        <w:t>Nov 2: entry due. Nov 9 to 13: screening. If shortlisted, Nov 16 to Dec 5: finish Stage 1 on a bench (conveyor, camera, CNN, battery, panel), build a scaled boat mock-up and the flood node, and a 3D model and wiring schematic. Dec 7: 30-minute pitch with a bench demo. Creek pilot January to February 2027 if supported. Stage gates: model reaches 85% on held-out photos, float and tilt tests pass, the boat reaches and scoops at least 70% of 20 floating items in a pond, and the flood alarm sounds at all three marks.</w:t>
+        <w:t>Nov 2: entry due. Nov 9 to 13: screening. If shortlisted, Nov 16 to Dec 5: finish Stage 1 on a bench (conveyor, camera, CNN, battery, panel), build a scaled boat mock-up and the flood node, and refine the 3D model (SAGIP_Boat_3D_Model.stl in Tinkercad) and the wiring schematic. Dec 7: 30-minute pitch with a bench demo. Creek pilot January to February 2027 if supported. Stage gates: model reaches 85% on held-out photos, float and tilt tests pass, the boat reaches and scoops at least 70% of 20 floating items in a pond, and the flood alarm sounds at all three marks.</w:t>
       </w:r>
     </w:p>
     <w:p>

</xml_diff>

<commit_message>
Fill provisional barangay (Santo Cristo, Bago Bantay) in proposal, PPT and prototype doc
Co-Authored-By: Claude Sonnet 5.5 <noreply@anthropic.com>
Claude-Session: https://claude.ai/code/session_01BeuSv9ktphNSqgYLtwXpw3
</commit_message>
<xml_diff>
--- a/sft_entry/SAGIP_SFT2026_Prototype_Design.docx
+++ b/sft_entry/SAGIP_SFT2026_Prototype_Design.docx
@@ -14,7 +14,16 @@
     </w:p>
     <w:p>
       <w:r>
-        <w:t>Quick visual of what we will build and buy. Quezon City Science High School, Grade 10 team. Adviser: Skjoukje U. Jemoya. Site: Dario River. All costs and sizes are planning estimates.</w:t>
+        <w:t xml:space="preserve">Quick visual of what we will build and buy. Quezon City Science High School, Grade 10 team. Adviser: Skjoukje U. Jemoya. Site: Dario River, </w:t>
+      </w:r>
+      <w:r>
+        <w:rPr>
+          <w:highlight w:val="yellow"/>
+        </w:rPr>
+        <w:t>[Barangay Santo Cristo, Bago Bantay, to confirm]</w:t>
+      </w:r>
+      <w:r>
+        <w:t>. All costs and sizes are planning estimates.</w:t>
       </w:r>
     </w:p>
     <w:p>

</xml_diff>